<commit_message>
A little more struct work
Added some more struct logic preparing to implement attacks that can have special effects.
</commit_message>
<xml_diff>
--- a/Version Control.docx
+++ b/Version Control.docx
@@ -157,7 +157,7 @@
               <w:rPr>
                 <w:rStyle w:val="Hyperlink"/>
               </w:rPr>
-              <w:t>https://github.com/s251388/AIE-2.1.4-Statistics.git</w:t>
+              <w:t>https://github.com/s251388/AIE-2.2.5-Mob-Battle.git</w:t>
             </w:r>
           </w:hyperlink>
         </w:sdtContent>
@@ -174,141 +174,6 @@
           <w:color w:val="FF0000"/>
         </w:rPr>
       </w:pPr>
-      <w:r>
-        <w:rPr>
-          <w:color w:val="FF0000"/>
-        </w:rPr>
-        <w:drawing>
-          <wp:inline distT="0" distB="0" distL="0" distR="0" wp14:anchorId="18DD50B0" wp14:editId="06BB92A6">
-            <wp:extent cx="5731510" cy="4770755"/>
-            <wp:effectExtent l="0" t="0" r="2540" b="0"/>
-            <wp:docPr id="2043864746" name="Picture 1"/>
-            <wp:cNvGraphicFramePr>
-              <a:graphicFrameLocks xmlns:a="http://schemas.openxmlformats.org/drawingml/2006/main" noChangeAspect="1"/>
-            </wp:cNvGraphicFramePr>
-            <a:graphic xmlns:a="http://schemas.openxmlformats.org/drawingml/2006/main">
-              <a:graphicData uri="http://schemas.openxmlformats.org/drawingml/2006/picture">
-                <pic:pic xmlns:pic="http://schemas.openxmlformats.org/drawingml/2006/picture">
-                  <pic:nvPicPr>
-                    <pic:cNvPr id="2043864746" name=""/>
-                    <pic:cNvPicPr/>
-                  </pic:nvPicPr>
-                  <pic:blipFill>
-                    <a:blip r:embed="rId9"/>
-                    <a:stretch>
-                      <a:fillRect/>
-                    </a:stretch>
-                  </pic:blipFill>
-                  <pic:spPr>
-                    <a:xfrm>
-                      <a:off x="0" y="0"/>
-                      <a:ext cx="5731510" cy="4770755"/>
-                    </a:xfrm>
-                    <a:prstGeom prst="rect">
-                      <a:avLst/>
-                    </a:prstGeom>
-                  </pic:spPr>
-                </pic:pic>
-              </a:graphicData>
-            </a:graphic>
-          </wp:inline>
-        </w:drawing>
-      </w:r>
-    </w:p>
-    <w:p>
-      <w:pPr>
-        <w:rPr>
-          <w:color w:val="FF0000"/>
-        </w:rPr>
-      </w:pPr>
-      <w:r>
-        <w:rPr>
-          <w:color w:val="FF0000"/>
-        </w:rPr>
-        <w:lastRenderedPageBreak/>
-        <w:drawing>
-          <wp:inline distT="0" distB="0" distL="0" distR="0" wp14:anchorId="38AEA96C" wp14:editId="5C8A5FC9">
-            <wp:extent cx="5731510" cy="3803650"/>
-            <wp:effectExtent l="0" t="0" r="2540" b="6350"/>
-            <wp:docPr id="2072066006" name="Picture 1"/>
-            <wp:cNvGraphicFramePr>
-              <a:graphicFrameLocks xmlns:a="http://schemas.openxmlformats.org/drawingml/2006/main" noChangeAspect="1"/>
-            </wp:cNvGraphicFramePr>
-            <a:graphic xmlns:a="http://schemas.openxmlformats.org/drawingml/2006/main">
-              <a:graphicData uri="http://schemas.openxmlformats.org/drawingml/2006/picture">
-                <pic:pic xmlns:pic="http://schemas.openxmlformats.org/drawingml/2006/picture">
-                  <pic:nvPicPr>
-                    <pic:cNvPr id="2072066006" name=""/>
-                    <pic:cNvPicPr/>
-                  </pic:nvPicPr>
-                  <pic:blipFill>
-                    <a:blip r:embed="rId10"/>
-                    <a:stretch>
-                      <a:fillRect/>
-                    </a:stretch>
-                  </pic:blipFill>
-                  <pic:spPr>
-                    <a:xfrm>
-                      <a:off x="0" y="0"/>
-                      <a:ext cx="5731510" cy="3803650"/>
-                    </a:xfrm>
-                    <a:prstGeom prst="rect">
-                      <a:avLst/>
-                    </a:prstGeom>
-                  </pic:spPr>
-                </pic:pic>
-              </a:graphicData>
-            </a:graphic>
-          </wp:inline>
-        </w:drawing>
-      </w:r>
-    </w:p>
-    <w:p>
-      <w:pPr>
-        <w:rPr>
-          <w:color w:val="FF0000"/>
-        </w:rPr>
-      </w:pPr>
-      <w:r>
-        <w:rPr>
-          <w:color w:val="FF0000"/>
-        </w:rPr>
-        <w:drawing>
-          <wp:inline distT="0" distB="0" distL="0" distR="0" wp14:anchorId="1A65700A" wp14:editId="342C66FD">
-            <wp:extent cx="5731510" cy="3858260"/>
-            <wp:effectExtent l="0" t="0" r="2540" b="8890"/>
-            <wp:docPr id="220009391" name="Picture 1"/>
-            <wp:cNvGraphicFramePr>
-              <a:graphicFrameLocks xmlns:a="http://schemas.openxmlformats.org/drawingml/2006/main" noChangeAspect="1"/>
-            </wp:cNvGraphicFramePr>
-            <a:graphic xmlns:a="http://schemas.openxmlformats.org/drawingml/2006/main">
-              <a:graphicData uri="http://schemas.openxmlformats.org/drawingml/2006/picture">
-                <pic:pic xmlns:pic="http://schemas.openxmlformats.org/drawingml/2006/picture">
-                  <pic:nvPicPr>
-                    <pic:cNvPr id="220009391" name=""/>
-                    <pic:cNvPicPr/>
-                  </pic:nvPicPr>
-                  <pic:blipFill>
-                    <a:blip r:embed="rId11"/>
-                    <a:stretch>
-                      <a:fillRect/>
-                    </a:stretch>
-                  </pic:blipFill>
-                  <pic:spPr>
-                    <a:xfrm>
-                      <a:off x="0" y="0"/>
-                      <a:ext cx="5731510" cy="3858260"/>
-                    </a:xfrm>
-                    <a:prstGeom prst="rect">
-                      <a:avLst/>
-                    </a:prstGeom>
-                  </pic:spPr>
-                </pic:pic>
-              </a:graphicData>
-            </a:graphic>
-          </wp:inline>
-        </w:drawing>
-      </w:r>
     </w:p>
     <w:p>
       <w:pPr>
@@ -357,7 +222,7 @@
             </w:sdtPr>
             <w:sdtContent>
               <w:r>
-                <w:t>N/A, random knowledge from other projects</w:t>
+                <w:t>Learning about pointers holding structs:</w:t>
               </w:r>
             </w:sdtContent>
           </w:sdt>
@@ -366,18 +231,27 @@
           </w:r>
         </w:sdtContent>
       </w:sdt>
-    </w:p>
-    <w:p>
-      <w:pPr>
-        <w:pStyle w:val="ListParagraph"/>
-        <w:numPr>
-          <w:ilvl w:val="0"/>
-          <w:numId w:val="6"/>
-        </w:numPr>
-      </w:pPr>
       <w:r>
-        <w:t>Random information from site snippets in Google search</w:t>
+        <w:t xml:space="preserve"> </w:t>
       </w:r>
+      <w:sdt>
+        <w:sdtPr>
+          <w:id w:val="784464922"/>
+          <w:placeholder>
+            <w:docPart w:val="294A0A4ABF73479E829D0154106F7090"/>
+          </w:placeholder>
+        </w:sdtPr>
+        <w:sdtContent>
+          <w:hyperlink r:id="rId9" w:history="1">
+            <w:r>
+              <w:rPr>
+                <w:rStyle w:val="Hyperlink"/>
+              </w:rPr>
+              <w:t>https://stackoverflow.com/questions/17716293/arrow-operator-and-dot-operator-class-pointer</w:t>
+            </w:r>
+          </w:hyperlink>
+        </w:sdtContent>
+      </w:sdt>
     </w:p>
     <w:p>
       <w:pPr>
@@ -462,14 +336,25 @@
       <w:sdtContent>
         <w:p>
           <w:r>
-            <w:t>I had fed the values into the function in the wrong order which caused me problems i couldn’t find for a while.</w:t>
+            <w:t>Learning why a pointer wouldn’t work with a struct. I messed around with it some more and eventually it auto-corrected my attempted *</w:t>
+          </w:r>
+          <w:r>
+            <w:t>Choose</w:t>
+          </w:r>
+          <w:r>
+            <w:t>.</w:t>
+          </w:r>
+          <w:r>
+            <w:t>Dmg</w:t>
+          </w:r>
+          <w:r>
+            <w:t xml:space="preserve"> into Choose-&gt;Dmg</w:t>
+          </w:r>
+          <w:r>
+            <w:t xml:space="preserve"> so i stopped for a bit to look up what that meant.</w:t>
           </w:r>
         </w:p>
-        <w:p>
-          <w:r>
-            <w:t>I wasn’t sure about how to round down an int while keeping to what the assessment task asked of me, but later found that ints seem to automatically round down if you attempt to assign them a non-whole number.</w:t>
-          </w:r>
-        </w:p>
+        <w:p/>
       </w:sdtContent>
     </w:sdt>
     <w:p>
@@ -554,13 +439,9 @@
             <w:placeholder>
               <w:docPart w:val="1B3D3DBEBE784756B2D94E2C341F8EB3"/>
             </w:placeholder>
+            <w:showingPlcHdr/>
           </w:sdtPr>
           <w:sdtContent>
-            <w:p>
-              <w:r>
-                <w:t>I’m still having trouble fleshing out my own consistent “style” with writing code.</w:t>
-              </w:r>
-            </w:p>
             <w:p>
               <w:pPr>
                 <w:rPr>
@@ -568,7 +449,10 @@
                 </w:rPr>
               </w:pPr>
               <w:r>
-                <w:t>It’s feeling awkward sending separate commits for the function, and the testing of the function, i feel like normally these would always be committed together, i assume this is only being done for these assessment projects for educational purposes.</w:t>
+                <w:rPr>
+                  <w:rStyle w:val="PlaceholderText"/>
+                </w:rPr>
+                <w:t>Click or tap here to enter text.</w:t>
               </w:r>
             </w:p>
           </w:sdtContent>
@@ -576,12 +460,12 @@
       </w:sdtContent>
     </w:sdt>
     <w:sectPr>
-      <w:headerReference w:type="even" r:id="rId12"/>
-      <w:headerReference w:type="default" r:id="rId13"/>
-      <w:footerReference w:type="even" r:id="rId14"/>
-      <w:footerReference w:type="default" r:id="rId15"/>
-      <w:headerReference w:type="first" r:id="rId16"/>
-      <w:footerReference w:type="first" r:id="rId17"/>
+      <w:headerReference w:type="even" r:id="rId10"/>
+      <w:headerReference w:type="default" r:id="rId11"/>
+      <w:footerReference w:type="even" r:id="rId12"/>
+      <w:footerReference w:type="default" r:id="rId13"/>
+      <w:headerReference w:type="first" r:id="rId14"/>
+      <w:footerReference w:type="first" r:id="rId15"/>
       <w:pgSz w:w="11906" w:h="16838"/>
       <w:pgMar w:top="1440" w:right="1440" w:bottom="1440" w:left="1440" w:header="170" w:footer="708" w:gutter="0"/>
       <w:cols w:space="708"/>
@@ -2125,7 +2009,6 @@
   <w:style w:type="character" w:default="1" w:styleId="DefaultParagraphFont">
     <w:name w:val="Default Paragraph Font"/>
     <w:uiPriority w:val="1"/>
-    <w:semiHidden/>
     <w:unhideWhenUsed/>
   </w:style>
   <w:style w:type="table" w:default="1" w:styleId="TableNormal">
@@ -3101,6 +2984,41 @@
         </w:p>
       </w:docPartBody>
     </w:docPart>
+    <w:docPart>
+      <w:docPartPr>
+        <w:name w:val="294A0A4ABF73479E829D0154106F7090"/>
+        <w:category>
+          <w:name w:val="General"/>
+          <w:gallery w:val="placeholder"/>
+        </w:category>
+        <w:types>
+          <w:type w:val="bbPlcHdr"/>
+        </w:types>
+        <w:behaviors>
+          <w:behavior w:val="content"/>
+        </w:behaviors>
+        <w:guid w:val="{FEFB8E71-DEA4-475D-BF08-A6CCC16AB76A}"/>
+      </w:docPartPr>
+      <w:docPartBody>
+        <w:p>
+          <w:pPr>
+            <w:pStyle w:val="294A0A4ABF73479E829D0154106F7090"/>
+          </w:pPr>
+          <w:r>
+            <w:rPr>
+              <w:rStyle w:val="PlaceholderText"/>
+            </w:rPr>
+            <w:t>Paste your link here</w:t>
+          </w:r>
+          <w:r>
+            <w:rPr>
+              <w:rStyle w:val="PlaceholderText"/>
+            </w:rPr>
+            <w:t>.</w:t>
+          </w:r>
+        </w:p>
+      </w:docPartBody>
+    </w:docPart>
   </w:docParts>
 </w:glossaryDocument>
 </file>
@@ -3174,11 +3092,14 @@
   </w:compat>
   <w:rsids>
     <w:rsidRoot w:val="00D1226A"/>
+    <w:rsid w:val="000B0A73"/>
+    <w:rsid w:val="002D1C95"/>
     <w:rsid w:val="00610C97"/>
     <w:rsid w:val="00672693"/>
     <w:rsid w:val="008B0955"/>
     <w:rsid w:val="00980631"/>
     <w:rsid w:val="00981A3F"/>
+    <w:rsid w:val="009F0750"/>
     <w:rsid w:val="00AC5F97"/>
     <w:rsid w:val="00B56AD6"/>
     <w:rsid w:val="00D1226A"/>
@@ -3636,7 +3557,7 @@
     <w:basedOn w:val="DefaultParagraphFont"/>
     <w:uiPriority w:val="99"/>
     <w:semiHidden/>
-    <w:rsid w:val="00672693"/>
+    <w:rsid w:val="000B0A73"/>
     <w:rPr>
       <w:color w:val="808080"/>
     </w:rPr>
@@ -3651,112 +3572,34 @@
       <w:lang w:eastAsia="en-US"/>
     </w:rPr>
   </w:style>
-  <w:style w:type="paragraph" w:customStyle="1" w:styleId="055B7ABDC6594D37A2D105E64730DB391">
-    <w:name w:val="055B7ABDC6594D37A2D105E64730DB391"/>
-    <w:rsid w:val="00B56AD6"/>
+  <w:style w:type="paragraph" w:customStyle="1" w:styleId="CFDDABCD98B0495C823D2015054112F8">
+    <w:name w:val="CFDDABCD98B0495C823D2015054112F8"/>
+    <w:rsid w:val="000B0A73"/>
     <w:pPr>
-      <w:spacing w:after="200" w:line="276" w:lineRule="auto"/>
+      <w:spacing w:line="278" w:lineRule="auto"/>
     </w:pPr>
     <w:rPr>
-      <w:lang w:eastAsia="en-US"/>
-    </w:rPr>
-  </w:style>
-  <w:style w:type="paragraph" w:customStyle="1" w:styleId="06FA6E0C26384CDB9A726F9B1A964BC1">
-    <w:name w:val="06FA6E0C26384CDB9A726F9B1A964BC1"/>
-    <w:rsid w:val="00B56AD6"/>
+      <w:kern w:val="2"/>
+      <w:sz w:val="24"/>
+      <w:szCs w:val="24"/>
+      <w14:ligatures w14:val="standardContextual"/>
+    </w:rPr>
+  </w:style>
+  <w:style w:type="paragraph" w:customStyle="1" w:styleId="294A0A4ABF73479E829D0154106F7090">
+    <w:name w:val="294A0A4ABF73479E829D0154106F7090"/>
+    <w:rsid w:val="000B0A73"/>
     <w:pPr>
-      <w:spacing w:after="200" w:line="276" w:lineRule="auto"/>
+      <w:spacing w:line="278" w:lineRule="auto"/>
     </w:pPr>
     <w:rPr>
-      <w:lang w:eastAsia="en-US"/>
+      <w:kern w:val="2"/>
+      <w:sz w:val="24"/>
+      <w:szCs w:val="24"/>
+      <w14:ligatures w14:val="standardContextual"/>
     </w:rPr>
   </w:style>
   <w:style w:type="paragraph" w:customStyle="1" w:styleId="DF23B91D8A4442A88B65D0165E0EDE26">
     <w:name w:val="DF23B91D8A4442A88B65D0165E0EDE26"/>
-    <w:rsid w:val="00B56AD6"/>
-    <w:pPr>
-      <w:spacing w:after="200" w:line="276" w:lineRule="auto"/>
-      <w:ind w:left="720"/>
-      <w:contextualSpacing/>
-    </w:pPr>
-    <w:rPr>
-      <w:lang w:eastAsia="en-US"/>
-    </w:rPr>
-  </w:style>
-  <w:style w:type="paragraph" w:customStyle="1" w:styleId="488E6452A82840BEA2A8DC1C6D0A2014">
-    <w:name w:val="488E6452A82840BEA2A8DC1C6D0A2014"/>
-    <w:rsid w:val="00B56AD6"/>
-    <w:pPr>
-      <w:spacing w:after="200" w:line="276" w:lineRule="auto"/>
-      <w:ind w:left="720"/>
-      <w:contextualSpacing/>
-    </w:pPr>
-    <w:rPr>
-      <w:lang w:eastAsia="en-US"/>
-    </w:rPr>
-  </w:style>
-  <w:style w:type="paragraph" w:customStyle="1" w:styleId="B8D516889DAA49C382A1648045C7EF4E">
-    <w:name w:val="B8D516889DAA49C382A1648045C7EF4E"/>
-    <w:rsid w:val="00B56AD6"/>
-    <w:pPr>
-      <w:spacing w:after="200" w:line="276" w:lineRule="auto"/>
-      <w:ind w:left="720"/>
-      <w:contextualSpacing/>
-    </w:pPr>
-    <w:rPr>
-      <w:lang w:eastAsia="en-US"/>
-    </w:rPr>
-  </w:style>
-  <w:style w:type="paragraph" w:customStyle="1" w:styleId="5A9145CE42C8478BBCCB1CEE0E4F4481">
-    <w:name w:val="5A9145CE42C8478BBCCB1CEE0E4F4481"/>
-    <w:rsid w:val="00B56AD6"/>
-    <w:pPr>
-      <w:spacing w:after="200" w:line="276" w:lineRule="auto"/>
-      <w:ind w:left="720"/>
-      <w:contextualSpacing/>
-    </w:pPr>
-    <w:rPr>
-      <w:lang w:eastAsia="en-US"/>
-    </w:rPr>
-  </w:style>
-  <w:style w:type="paragraph" w:customStyle="1" w:styleId="CF6031E566304451A8943E7D31AA1C52">
-    <w:name w:val="CF6031E566304451A8943E7D31AA1C52"/>
-    <w:rsid w:val="00B56AD6"/>
-    <w:pPr>
-      <w:spacing w:after="200" w:line="276" w:lineRule="auto"/>
-      <w:ind w:left="720"/>
-      <w:contextualSpacing/>
-    </w:pPr>
-    <w:rPr>
-      <w:lang w:eastAsia="en-US"/>
-    </w:rPr>
-  </w:style>
-  <w:style w:type="paragraph" w:customStyle="1" w:styleId="B8B605B505684E51BD858D66783BDF7F">
-    <w:name w:val="B8B605B505684E51BD858D66783BDF7F"/>
-    <w:rsid w:val="00B56AD6"/>
-    <w:pPr>
-      <w:spacing w:after="200" w:line="276" w:lineRule="auto"/>
-      <w:ind w:left="720"/>
-      <w:contextualSpacing/>
-    </w:pPr>
-    <w:rPr>
-      <w:lang w:eastAsia="en-US"/>
-    </w:rPr>
-  </w:style>
-  <w:style w:type="paragraph" w:customStyle="1" w:styleId="ACFCCD54B4D1492EAA109C300B9CCF7A">
-    <w:name w:val="ACFCCD54B4D1492EAA109C300B9CCF7A"/>
-    <w:rsid w:val="00B56AD6"/>
-    <w:pPr>
-      <w:spacing w:after="200" w:line="276" w:lineRule="auto"/>
-      <w:ind w:left="720"/>
-      <w:contextualSpacing/>
-    </w:pPr>
-    <w:rPr>
-      <w:lang w:eastAsia="en-US"/>
-    </w:rPr>
-  </w:style>
-  <w:style w:type="paragraph" w:customStyle="1" w:styleId="43832A401D544A11B2E3CAE6030736EA">
-    <w:name w:val="43832A401D544A11B2E3CAE6030736EA"/>
     <w:rsid w:val="00B56AD6"/>
     <w:pPr>
       <w:spacing w:after="200" w:line="276" w:lineRule="auto"/>

</xml_diff>